<commit_message>
added sem 1 qba
</commit_message>
<xml_diff>
--- a/Research Methodology/Research Report Paper/Data_Visualization.docx
+++ b/Research Methodology/Research Report Paper/Data_Visualization.docx
@@ -95,7 +95,23 @@
           <w:b/>
           <w:sz w:val="28"/>
         </w:rPr>
-        <w:t>MSATER OF SCIENCE (INFORMATION TECHNOLOGY)</w:t>
+        <w:t>M</w:t>
+      </w:r>
+      <w:r>
+        <w:rPr>
+          <w:rFonts w:ascii="Times New Roman" w:hAnsi="Times New Roman" w:cs="Times New Roman"/>
+          <w:b/>
+          <w:sz w:val="28"/>
+        </w:rPr>
+        <w:t>AS</w:t>
+      </w:r>
+      <w:r>
+        <w:rPr>
+          <w:rFonts w:ascii="Times New Roman" w:hAnsi="Times New Roman" w:cs="Times New Roman"/>
+          <w:b/>
+          <w:sz w:val="28"/>
+        </w:rPr>
+        <w:t>TER OF SCIENCE (INFORMATION TECHNOLOGY)</w:t>
       </w:r>
     </w:p>
     <w:p>
@@ -21350,6 +21366,10 @@
 </file>
 
 <file path=customXml/item1.xml><?xml version="1.0" encoding="utf-8"?>
+<b:Sources xmlns:b="http://schemas.openxmlformats.org/officeDocument/2006/bibliography" xmlns="http://schemas.openxmlformats.org/officeDocument/2006/bibliography" SelectedStyle="/APA.XSL" StyleName="APA"/>
+</file>
+
+<file path=customXml/item2.xml><?xml version="1.0" encoding="utf-8"?>
 <s:customData xmlns="http://www.wps.cn/officeDocument/2013/wpsCustomData" xmlns:s="http://www.wps.cn/officeDocument/2013/wpsCustomData">
   <customSectProps>
     <customSectPr/>
@@ -21364,22 +21384,18 @@
 </s:customData>
 </file>
 
-<file path=customXml/item2.xml><?xml version="1.0" encoding="utf-8"?>
-<b:Sources xmlns:b="http://schemas.openxmlformats.org/officeDocument/2006/bibliography" xmlns="http://schemas.openxmlformats.org/officeDocument/2006/bibliography" SelectedStyle="/APA.XSL" StyleName="APA"/>
+<file path=customXml/itemProps1.xml><?xml version="1.0" encoding="utf-8"?>
+<ds:datastoreItem xmlns:ds="http://schemas.openxmlformats.org/officeDocument/2006/customXml" ds:itemID="{EF278816-EC6F-A645-907D-7F25AECB1D4A}">
+  <ds:schemaRefs>
+    <ds:schemaRef ds:uri="http://schemas.openxmlformats.org/officeDocument/2006/bibliography"/>
+  </ds:schemaRefs>
+</ds:datastoreItem>
 </file>
 
-<file path=customXml/itemProps1.xml><?xml version="1.0" encoding="utf-8"?>
+<file path=customXml/itemProps2.xml><?xml version="1.0" encoding="utf-8"?>
 <ds:datastoreItem xmlns:ds="http://schemas.openxmlformats.org/officeDocument/2006/customXml" ds:itemID="{B1977F7D-205B-4081-913C-38D41E755F92}">
   <ds:schemaRefs>
     <ds:schemaRef ds:uri="http://www.wps.cn/officeDocument/2013/wpsCustomData"/>
   </ds:schemaRefs>
 </ds:datastoreItem>
-</file>
-
-<file path=customXml/itemProps2.xml><?xml version="1.0" encoding="utf-8"?>
-<ds:datastoreItem xmlns:ds="http://schemas.openxmlformats.org/officeDocument/2006/customXml" ds:itemID="{EF278816-EC6F-A645-907D-7F25AECB1D4A}">
-  <ds:schemaRefs>
-    <ds:schemaRef ds:uri="http://schemas.openxmlformats.org/officeDocument/2006/bibliography"/>
-  </ds:schemaRefs>
-</ds:datastoreItem>
 </file>
</xml_diff>